<commit_message>
Fix Conga template merge tags
Co-authored-by: agrarpro-oujda <agrarpro-oujda@users.noreply.github.com>
</commit_message>
<xml_diff>
--- a/CongaTemplateDocument.docx
+++ b/CongaTemplateDocument.docx
@@ -8518,7 +8518,7 @@
                 <w:szCs w:val="16"/>
                 <w:lang w:val="en-US"/>
               </w:rPr>
-              <w:t>{{</w:t>
+              <w:t>{{OFFERDETAILS_SUBSCRIBEDPOWER}}</w:t>
             </w:r>
             <w:r>
               <w:rPr>
@@ -8528,7 +8528,7 @@
                 <w:szCs w:val="16"/>
                 <w:lang w:val="en-US"/>
               </w:rPr>
-              <w:t>REPLACE:</w:t>
+              <w:t/>
             </w:r>
             <w:r>
               <w:rPr>
@@ -8538,7 +8538,7 @@
                 <w:szCs w:val="16"/>
                 <w:lang w:val="en-US"/>
               </w:rPr>
-              <w:t>OFFERDETAILS_SUBSCRIBEDPOWER</w:t>
+              <w:t/>
             </w:r>
             <w:r>
               <w:rPr>
@@ -8548,7 +8548,7 @@
                 <w:szCs w:val="16"/>
                 <w:lang w:val="en-US"/>
               </w:rPr>
-              <w:t>:</w:t>
+              <w:t/>
             </w:r>
             <w:r>
               <w:rPr>
@@ -8558,7 +8558,7 @@
                 <w:szCs w:val="16"/>
                 <w:lang w:val="en-US"/>
               </w:rPr>
-              <w:t>NL</w:t>
+              <w:t/>
             </w:r>
             <w:r>
               <w:rPr>
@@ -8568,7 +8568,7 @@
                 <w:szCs w:val="16"/>
                 <w:lang w:val="en-US"/>
               </w:rPr>
-              <w:t>:</w:t>
+              <w:t/>
             </w:r>
             <w:r>
               <w:rPr>
@@ -8578,7 +8578,7 @@
                 <w:szCs w:val="16"/>
                 <w:lang w:val="en-US"/>
               </w:rPr>
-              <w:t>{NEWLINE}</w:t>
+              <w:t/>
             </w:r>
             <w:r>
               <w:rPr>
@@ -8588,7 +8588,7 @@
                 <w:szCs w:val="16"/>
                 <w:lang w:val="en-US"/>
               </w:rPr>
-              <w:t xml:space="preserve"> </w:t>
+              <w:t xml:space="preserve"/>
             </w:r>
             <w:r>
               <w:rPr>
@@ -8598,7 +8598,7 @@
                 <w:szCs w:val="16"/>
                 <w:lang w:val="en-US"/>
               </w:rPr>
-              <w:t>}}</w:t>
+              <w:t/>
             </w:r>
             <w:r>
               <w:rPr>

</xml_diff>

<commit_message>
Fix Conga template merge tags (#1)
Co-authored-by: Cursor Agent <cursoragent@cursor.com>
Co-authored-by: agrarpro-oujda <agrarpro-oujda@users.noreply.github.com>
</commit_message>
<xml_diff>
--- a/CongaTemplateDocument.docx
+++ b/CongaTemplateDocument.docx
@@ -8518,7 +8518,7 @@
                 <w:szCs w:val="16"/>
                 <w:lang w:val="en-US"/>
               </w:rPr>
-              <w:t>{{</w:t>
+              <w:t>{{OFFERDETAILS_SUBSCRIBEDPOWER}}</w:t>
             </w:r>
             <w:r>
               <w:rPr>
@@ -8528,7 +8528,7 @@
                 <w:szCs w:val="16"/>
                 <w:lang w:val="en-US"/>
               </w:rPr>
-              <w:t>REPLACE:</w:t>
+              <w:t/>
             </w:r>
             <w:r>
               <w:rPr>
@@ -8538,7 +8538,7 @@
                 <w:szCs w:val="16"/>
                 <w:lang w:val="en-US"/>
               </w:rPr>
-              <w:t>OFFERDETAILS_SUBSCRIBEDPOWER</w:t>
+              <w:t/>
             </w:r>
             <w:r>
               <w:rPr>
@@ -8548,7 +8548,7 @@
                 <w:szCs w:val="16"/>
                 <w:lang w:val="en-US"/>
               </w:rPr>
-              <w:t>:</w:t>
+              <w:t/>
             </w:r>
             <w:r>
               <w:rPr>
@@ -8558,7 +8558,7 @@
                 <w:szCs w:val="16"/>
                 <w:lang w:val="en-US"/>
               </w:rPr>
-              <w:t>NL</w:t>
+              <w:t/>
             </w:r>
             <w:r>
               <w:rPr>
@@ -8568,7 +8568,7 @@
                 <w:szCs w:val="16"/>
                 <w:lang w:val="en-US"/>
               </w:rPr>
-              <w:t>:</w:t>
+              <w:t/>
             </w:r>
             <w:r>
               <w:rPr>
@@ -8578,7 +8578,7 @@
                 <w:szCs w:val="16"/>
                 <w:lang w:val="en-US"/>
               </w:rPr>
-              <w:t>{NEWLINE}</w:t>
+              <w:t/>
             </w:r>
             <w:r>
               <w:rPr>
@@ -8588,7 +8588,7 @@
                 <w:szCs w:val="16"/>
                 <w:lang w:val="en-US"/>
               </w:rPr>
-              <w:t xml:space="preserve"> </w:t>
+              <w:t xml:space="preserve"/>
             </w:r>
             <w:r>
               <w:rPr>
@@ -8598,7 +8598,7 @@
                 <w:szCs w:val="16"/>
                 <w:lang w:val="en-US"/>
               </w:rPr>
-              <w:t>}}</w:t>
+              <w:t/>
             </w:r>
             <w:r>
               <w:rPr>

</xml_diff>